<commit_message>
guia: secao BS Detector atualizada para o modelo Trend Meter (aproximacao + calibracao)
</commit_message>
<xml_diff>
--- a/GUIA_CONFIRMACAO_SNIPER.docx
+++ b/GUIA_CONFIRMACAO_SNIPER.docx
@@ -1455,6 +1455,194 @@
     </w:p>
     <w:p>
       <w:pPr>
+        <w:pStyle w:val="BlockText"/>
+      </w:pPr>
+      <w:r>
+        <w:rPr>
+          <w:bCs/>
+          <w:b/>
+        </w:rPr>
+        <w:t xml:space="preserve">IMPORTANTE — por que o helper mudou.</w:t>
+      </w:r>
+      <w:r>
+        <w:t xml:space="preserve"> </w:t>
+      </w:r>
+      <w:r>
+        <w:t xml:space="preserve">O Pine (linguagem do TradingView)</w:t>
+      </w:r>
+      <w:r>
+        <w:t xml:space="preserve"> </w:t>
+      </w:r>
+      <w:r>
+        <w:t xml:space="preserve">só lê o</w:t>
+      </w:r>
+      <w:r>
+        <w:t xml:space="preserve"> </w:t>
+      </w:r>
+      <w:r>
+        <w:rPr>
+          <w:bCs/>
+          <w:b/>
+        </w:rPr>
+        <w:t xml:space="preserve">valor</w:t>
+      </w:r>
+      <w:r>
+        <w:t xml:space="preserve"> </w:t>
+      </w:r>
+      <w:r>
+        <w:t xml:space="preserve">(número) de um plot,</w:t>
+      </w:r>
+      <w:r>
+        <w:t xml:space="preserve"> </w:t>
+      </w:r>
+      <w:r>
+        <w:rPr>
+          <w:bCs/>
+          <w:b/>
+        </w:rPr>
+        <w:t xml:space="preserve">nunca a cor</w:t>
+      </w:r>
+      <w:r>
+        <w:t xml:space="preserve">. O BS Detector pinta</w:t>
+      </w:r>
+      <w:r>
+        <w:t xml:space="preserve"> </w:t>
+      </w:r>
+      <w:r>
+        <w:t xml:space="preserve">os plots com 6 cores por uma lógica</w:t>
+      </w:r>
+      <w:r>
+        <w:t xml:space="preserve"> </w:t>
+      </w:r>
+      <w:r>
+        <w:rPr>
+          <w:bCs/>
+          <w:b/>
+        </w:rPr>
+        <w:t xml:space="preserve">interna fechada</w:t>
+      </w:r>
+      <w:r>
+        <w:t xml:space="preserve">, então não dá para</w:t>
+      </w:r>
+      <w:r>
+        <w:t xml:space="preserve"> </w:t>
+      </w:r>
+      <w:r>
+        <w:t xml:space="preserve">“</w:t>
+      </w:r>
+      <w:r>
+        <w:t xml:space="preserve">ler a cor</w:t>
+      </w:r>
+      <w:r>
+        <w:t xml:space="preserve">”</w:t>
+      </w:r>
+      <w:r>
+        <w:t xml:space="preserve"> </w:t>
+      </w:r>
+      <w:r>
+        <w:t xml:space="preserve">dele. A solução é por</w:t>
+      </w:r>
+      <w:r>
+        <w:t xml:space="preserve"> </w:t>
+      </w:r>
+      <w:r>
+        <w:rPr>
+          <w:bCs/>
+          <w:b/>
+        </w:rPr>
+        <w:t xml:space="preserve">aproximação</w:t>
+      </w:r>
+      <w:r>
+        <w:t xml:space="preserve">: o helper agora</w:t>
+      </w:r>
+      <w:r>
+        <w:t xml:space="preserve"> </w:t>
+      </w:r>
+      <w:r>
+        <w:rPr>
+          <w:bCs/>
+          <w:b/>
+        </w:rPr>
+        <w:t xml:space="preserve">calcula</w:t>
+      </w:r>
+      <w:r>
+        <w:rPr>
+          <w:bCs/>
+          <w:b/>
+        </w:rPr>
+        <w:t xml:space="preserve"> </w:t>
+      </w:r>
+      <w:r>
+        <w:rPr>
+          <w:bCs/>
+          <w:b/>
+        </w:rPr>
+        <w:t xml:space="preserve">a cor sozinho, a partir do preço</w:t>
+      </w:r>
+      <w:r>
+        <w:t xml:space="preserve">, usando as mesmas contas do indicador</w:t>
+      </w:r>
+      <w:r>
+        <w:t xml:space="preserve"> </w:t>
+      </w:r>
+      <w:r>
+        <w:t xml:space="preserve">aberto</w:t>
+      </w:r>
+      <w:r>
+        <w:t xml:space="preserve"> </w:t>
+      </w:r>
+      <w:r>
+        <w:rPr>
+          <w:bCs/>
+          <w:b/>
+        </w:rPr>
+        <w:t xml:space="preserve">“</w:t>
+      </w:r>
+      <w:r>
+        <w:rPr>
+          <w:bCs/>
+          <w:b/>
+        </w:rPr>
+        <w:t xml:space="preserve">Trend Meter (by Lij_MC)</w:t>
+      </w:r>
+      <w:r>
+        <w:rPr>
+          <w:bCs/>
+          <w:b/>
+        </w:rPr>
+        <w:t xml:space="preserve">”</w:t>
+      </w:r>
+      <w:r>
+        <w:t xml:space="preserve"> </w:t>
+      </w:r>
+      <w:r>
+        <w:t xml:space="preserve">— que muda de cor lateralmente igual</w:t>
+      </w:r>
+      <w:r>
+        <w:t xml:space="preserve"> </w:t>
+      </w:r>
+      <w:r>
+        <w:t xml:space="preserve">aos plots do BS Detector. Você escolhe a conta de cada componente e vai</w:t>
+      </w:r>
+      <w:r>
+        <w:t xml:space="preserve"> </w:t>
+      </w:r>
+      <w:r>
+        <w:rPr>
+          <w:bCs/>
+          <w:b/>
+        </w:rPr>
+        <w:t xml:space="preserve">calibrando</w:t>
+      </w:r>
+      <w:r>
+        <w:t xml:space="preserve"> </w:t>
+      </w:r>
+      <w:r>
+        <w:t xml:space="preserve">até o painel do helper ficar igual ao BS Detector.</w:t>
+      </w:r>
+    </w:p>
+    <w:p>
+      <w:pPr>
         <w:numPr>
           <w:ilvl w:val="0"/>
           <w:numId w:val="1003"/>
@@ -1545,7 +1733,23 @@
         <w:t xml:space="preserve">BSDET HELPER v4</w:t>
       </w:r>
       <w:r>
-        <w:t xml:space="preserve">.</w:t>
+        <w:t xml:space="preserve"> </w:t>
+      </w:r>
+      <w:r>
+        <w:t xml:space="preserve">(o BS Detector fica só para você</w:t>
+      </w:r>
+      <w:r>
+        <w:t xml:space="preserve"> </w:t>
+      </w:r>
+      <w:r>
+        <w:rPr>
+          <w:bCs/>
+          <w:b/>
+        </w:rPr>
+        <w:t xml:space="preserve">comparar as cores</w:t>
+      </w:r>
+      <w:r>
+        <w:t xml:space="preserve">).</w:t>
       </w:r>
     </w:p>
     <w:p>
@@ -1573,25 +1777,56 @@
         <w:t xml:space="preserve"> </w:t>
       </w:r>
       <w:r>
-        <w:t xml:space="preserve">do helper, ligue cada</w:t>
-      </w:r>
-      <w:r>
-        <w:t xml:space="preserve"> </w:t>
-      </w:r>
-      <w:r>
+        <w:t xml:space="preserve">do helper, no grupo</w:t>
+      </w:r>
+      <w:r>
+        <w:t xml:space="preserve"> </w:t>
+      </w:r>
+      <w:r>
+        <w:rPr>
+          <w:bCs/>
+          <w:b/>
+        </w:rPr>
         <w:t xml:space="preserve">“</w:t>
       </w:r>
       <w:r>
-        <w:t xml:space="preserve">source</w:t>
-      </w:r>
-      <w:r>
+        <w:rPr>
+          <w:bCs/>
+          <w:b/>
+        </w:rPr>
+        <w:t xml:space="preserve">Regra de cor por componente</w:t>
+      </w:r>
+      <w:r>
+        <w:rPr>
+          <w:bCs/>
+          <w:b/>
+        </w:rPr>
         <w:t xml:space="preserve">”</w:t>
       </w:r>
       <w:r>
-        <w:t xml:space="preserve"> </w:t>
-      </w:r>
-      <w:r>
-        <w:t xml:space="preserve">na saída certa do BS Detector:</w:t>
+        <w:t xml:space="preserve">,</w:t>
+      </w:r>
+      <w:r>
+        <w:t xml:space="preserve"> </w:t>
+      </w:r>
+      <w:r>
+        <w:t xml:space="preserve">escolha para cada um (Histograma, Plot 1, Plot 2, Plot 3)</w:t>
+      </w:r>
+      <w:r>
+        <w:t xml:space="preserve"> </w:t>
+      </w:r>
+      <w:r>
+        <w:rPr>
+          <w:bCs/>
+          <w:b/>
+        </w:rPr>
+        <w:t xml:space="preserve">qual conta</w:t>
+      </w:r>
+      <w:r>
+        <w:t xml:space="preserve"> </w:t>
+      </w:r>
+      <w:r>
+        <w:t xml:space="preserve">usar. As opções são as contas do Trend Meter:</w:t>
       </w:r>
     </w:p>
     <w:p>
@@ -1607,13 +1842,13 @@
           <w:bCs/>
           <w:b/>
         </w:rPr>
-        <w:t xml:space="preserve">Histograma (source)</w:t>
-      </w:r>
-      <w:r>
-        <w:t xml:space="preserve"> </w:t>
-      </w:r>
-      <w:r>
-        <w:t xml:space="preserve">→ saída do histograma</w:t>
+        <w:t xml:space="preserve">Fast MACD 8/21/5</w:t>
+      </w:r>
+      <w:r>
+        <w:t xml:space="preserve"> </w:t>
+      </w:r>
+      <w:r>
+        <w:t xml:space="preserve">— histograma do MACD rápido</w:t>
       </w:r>
     </w:p>
     <w:p>
@@ -1629,13 +1864,13 @@
           <w:bCs/>
           <w:b/>
         </w:rPr>
-        <w:t xml:space="preserve">Plot 1 (source)</w:t>
-      </w:r>
-      <w:r>
-        <w:t xml:space="preserve"> </w:t>
-      </w:r>
-      <w:r>
-        <w:t xml:space="preserve">→ Plot 1</w:t>
+        <w:t xml:space="preserve">MACD 12/26/9</w:t>
+      </w:r>
+      <w:r>
+        <w:t xml:space="preserve"> </w:t>
+      </w:r>
+      <w:r>
+        <w:t xml:space="preserve">— histograma do MACD clássico</w:t>
       </w:r>
     </w:p>
     <w:p>
@@ -1651,13 +1886,23 @@
           <w:bCs/>
           <w:b/>
         </w:rPr>
-        <w:t xml:space="preserve">Plot 2 (source)</w:t>
-      </w:r>
-      <w:r>
-        <w:t xml:space="preserve"> </w:t>
-      </w:r>
-      <w:r>
-        <w:t xml:space="preserve">→ Plot 2</w:t>
+        <w:t xml:space="preserve">RSI 13 &gt; 50</w:t>
+      </w:r>
+      <w:r>
+        <w:t xml:space="preserve"> </w:t>
+      </w:r>
+      <w:r>
+        <w:t xml:space="preserve">/</w:t>
+      </w:r>
+      <w:r>
+        <w:t xml:space="preserve"> </w:t>
+      </w:r>
+      <w:r>
+        <w:rPr>
+          <w:bCs/>
+          <w:b/>
+        </w:rPr>
+        <w:t xml:space="preserve">RSI 5 &gt; 50</w:t>
       </w:r>
     </w:p>
     <w:p>
@@ -1673,13 +1918,154 @@
           <w:bCs/>
           <w:b/>
         </w:rPr>
-        <w:t xml:space="preserve">Plot 3 (source)</w:t>
-      </w:r>
-      <w:r>
-        <w:t xml:space="preserve"> </w:t>
-      </w:r>
-      <w:r>
-        <w:t xml:space="preserve">→ Plot 3</w:t>
+        <w:t xml:space="preserve">Mom/Dad Cross</w:t>
+      </w:r>
+      <w:r>
+        <w:t xml:space="preserve"> </w:t>
+      </w:r>
+      <w:r>
+        <w:t xml:space="preserve">(Top Dog) /</w:t>
+      </w:r>
+      <w:r>
+        <w:t xml:space="preserve"> </w:t>
+      </w:r>
+      <w:r>
+        <w:rPr>
+          <w:bCs/>
+          <w:b/>
+        </w:rPr>
+        <w:t xml:space="preserve">RSI Signal Cross 13/21</w:t>
+      </w:r>
+      <w:r>
+        <w:t xml:space="preserve"> </w:t>
+      </w:r>
+      <w:r>
+        <w:t xml:space="preserve">/</w:t>
+      </w:r>
+      <w:r>
+        <w:t xml:space="preserve"> </w:t>
+      </w:r>
+      <w:r>
+        <w:rPr>
+          <w:bCs/>
+          <w:b/>
+        </w:rPr>
+        <w:t xml:space="preserve">MA Cross 5/11</w:t>
+      </w:r>
+    </w:p>
+    <w:p>
+      <w:pPr>
+        <w:numPr>
+          <w:ilvl w:val="1"/>
+          <w:numId w:val="1004"/>
+        </w:numPr>
+        <w:pStyle w:val="Compact"/>
+      </w:pPr>
+      <w:r>
+        <w:rPr>
+          <w:bCs/>
+          <w:b/>
+        </w:rPr>
+        <w:t xml:space="preserve">Trend Candles</w:t>
+      </w:r>
+      <w:r>
+        <w:t xml:space="preserve"> </w:t>
+      </w:r>
+      <w:r>
+        <w:t xml:space="preserve">(Heikin-Ashi)</w:t>
+      </w:r>
+    </w:p>
+    <w:p>
+      <w:pPr>
+        <w:numPr>
+          <w:ilvl w:val="1"/>
+          <w:numId w:val="1004"/>
+        </w:numPr>
+        <w:pStyle w:val="Compact"/>
+      </w:pPr>
+      <w:r>
+        <w:t xml:space="preserve">(também há</w:t>
+      </w:r>
+      <w:r>
+        <w:t xml:space="preserve"> </w:t>
+      </w:r>
+      <w:r>
+        <w:rPr>
+          <w:bCs/>
+          <w:b/>
+        </w:rPr>
+        <w:t xml:space="preserve">“</w:t>
+      </w:r>
+      <w:r>
+        <w:rPr>
+          <w:bCs/>
+          <w:b/>
+        </w:rPr>
+        <w:t xml:space="preserve">Fonte: Positivo</w:t>
+      </w:r>
+      <w:r>
+        <w:rPr>
+          <w:bCs/>
+          <w:b/>
+        </w:rPr>
+        <w:t xml:space="preserve">”</w:t>
+      </w:r>
+      <w:r>
+        <w:t xml:space="preserve"> </w:t>
+      </w:r>
+      <w:r>
+        <w:t xml:space="preserve">e</w:t>
+      </w:r>
+      <w:r>
+        <w:t xml:space="preserve"> </w:t>
+      </w:r>
+      <w:r>
+        <w:rPr>
+          <w:bCs/>
+          <w:b/>
+        </w:rPr>
+        <w:t xml:space="preserve">“</w:t>
+      </w:r>
+      <w:r>
+        <w:rPr>
+          <w:bCs/>
+          <w:b/>
+        </w:rPr>
+        <w:t xml:space="preserve">Fonte: Subindo</w:t>
+      </w:r>
+      <w:r>
+        <w:rPr>
+          <w:bCs/>
+          <w:b/>
+        </w:rPr>
+        <w:t xml:space="preserve">”</w:t>
+      </w:r>
+      <w:r>
+        <w:t xml:space="preserve"> </w:t>
+      </w:r>
+      <w:r>
+        <w:t xml:space="preserve">como fallback, se</w:t>
+      </w:r>
+      <w:r>
+        <w:t xml:space="preserve"> </w:t>
+      </w:r>
+      <w:r>
+        <w:t xml:space="preserve">você preferir ligar direto num plot pelo campo</w:t>
+      </w:r>
+      <w:r>
+        <w:t xml:space="preserve"> </w:t>
+      </w:r>
+      <w:r>
+        <w:t xml:space="preserve">“</w:t>
+      </w:r>
+      <w:r>
+        <w:t xml:space="preserve">Fonte … opcional</w:t>
+      </w:r>
+      <w:r>
+        <w:t xml:space="preserve">”</w:t>
+      </w:r>
+      <w:r>
+        <w:t xml:space="preserve">)</w:t>
       </w:r>
     </w:p>
     <w:p>
@@ -1691,7 +2077,30 @@
         <w:pStyle w:val="Compact"/>
       </w:pPr>
       <w:r>
-        <w:t xml:space="preserve">Confira o painel no canto do gráfico: ele mostra a cor de cada um.</w:t>
+        <w:rPr>
+          <w:bCs/>
+          <w:b/>
+        </w:rPr>
+        <w:t xml:space="preserve">Calibre olhando o painel</w:t>
+      </w:r>
+      <w:r>
+        <w:t xml:space="preserve"> </w:t>
+      </w:r>
+      <w:r>
+        <w:t xml:space="preserve">(canto superior direito)</w:t>
+      </w:r>
+      <w:r>
+        <w:t xml:space="preserve"> </w:t>
+      </w:r>
+      <w:r>
+        <w:rPr>
+          <w:bCs/>
+          <w:b/>
+        </w:rPr>
+        <w:t xml:space="preserve">contra o BS Detector</w:t>
+      </w:r>
+      <w:r>
+        <w:t xml:space="preserve">:</w:t>
       </w:r>
     </w:p>
     <w:p>
@@ -1703,29 +2112,57 @@
         <w:pStyle w:val="Compact"/>
       </w:pPr>
       <w:r>
-        <w:t xml:space="preserve">Se alguma cor estiver</w:t>
-      </w:r>
-      <w:r>
-        <w:t xml:space="preserve"> </w:t>
-      </w:r>
-      <w:r>
-        <w:rPr>
-          <w:bCs/>
-          <w:b/>
-        </w:rPr>
-        <w:t xml:space="preserve">invertida</w:t>
-      </w:r>
-      <w:r>
-        <w:t xml:space="preserve"> </w:t>
-      </w:r>
-      <w:r>
-        <w:t xml:space="preserve">em relação ao que você vê, marque a</w:t>
-      </w:r>
-      <w:r>
-        <w:t xml:space="preserve"> </w:t>
-      </w:r>
-      <w:r>
-        <w:t xml:space="preserve">opção</w:t>
+        <w:t xml:space="preserve">Troque a conta no menu até a cor de cada componente</w:t>
+      </w:r>
+      <w:r>
+        <w:t xml:space="preserve"> </w:t>
+      </w:r>
+      <w:r>
+        <w:rPr>
+          <w:bCs/>
+          <w:b/>
+        </w:rPr>
+        <w:t xml:space="preserve">bater</w:t>
+      </w:r>
+      <w:r>
+        <w:t xml:space="preserve"> </w:t>
+      </w:r>
+      <w:r>
+        <w:t xml:space="preserve">com o BS</w:t>
+      </w:r>
+      <w:r>
+        <w:t xml:space="preserve"> </w:t>
+      </w:r>
+      <w:r>
+        <w:t xml:space="preserve">Detector na maior parte do tempo.</w:t>
+      </w:r>
+    </w:p>
+    <w:p>
+      <w:pPr>
+        <w:numPr>
+          <w:ilvl w:val="1"/>
+          <w:numId w:val="1005"/>
+        </w:numPr>
+        <w:pStyle w:val="Compact"/>
+      </w:pPr>
+      <w:r>
+        <w:t xml:space="preserve">Se a cor sair</w:t>
+      </w:r>
+      <w:r>
+        <w:t xml:space="preserve"> </w:t>
+      </w:r>
+      <w:r>
+        <w:rPr>
+          <w:bCs/>
+          <w:b/>
+        </w:rPr>
+        <w:t xml:space="preserve">trocada</w:t>
+      </w:r>
+      <w:r>
+        <w:t xml:space="preserve"> </w:t>
+      </w:r>
+      <w:r>
+        <w:t xml:space="preserve">(verde onde devia ser vermelho), marque</w:t>
       </w:r>
       <w:r>
         <w:t xml:space="preserve"> </w:t>
@@ -1742,7 +2179,7 @@
           <w:bCs/>
           <w:b/>
         </w:rPr>
-        <w:t xml:space="preserve">Inverter</w:t>
+        <w:t xml:space="preserve">inverter cor</w:t>
       </w:r>
       <w:r>
         <w:rPr>
@@ -1755,20 +2192,38 @@
         <w:t xml:space="preserve"> </w:t>
       </w:r>
       <w:r>
-        <w:t xml:space="preserve">no input (ou ajuste o</w:t>
-      </w:r>
-      <w:r>
-        <w:t xml:space="preserve"> </w:t>
-      </w:r>
-      <w:r>
-        <w:rPr>
-          <w:bCs/>
-          <w:b/>
-        </w:rPr>
-        <w:t xml:space="preserve">Limiar</w:t>
-      </w:r>
-      <w:r>
-        <w:t xml:space="preserve">).</w:t>
+        <w:t xml:space="preserve">daquele componente.</w:t>
+      </w:r>
+    </w:p>
+    <w:p>
+      <w:pPr>
+        <w:numPr>
+          <w:ilvl w:val="1"/>
+          <w:numId w:val="1005"/>
+        </w:numPr>
+        <w:pStyle w:val="Compact"/>
+      </w:pPr>
+      <w:r>
+        <w:t xml:space="preserve">É</w:t>
+      </w:r>
+      <w:r>
+        <w:t xml:space="preserve"> </w:t>
+      </w:r>
+      <w:r>
+        <w:rPr>
+          <w:bCs/>
+          <w:b/>
+        </w:rPr>
+        <w:t xml:space="preserve">aproximação</w:t>
+      </w:r>
+      <w:r>
+        <w:t xml:space="preserve">: não precisa ficar 100% em toda vela — busque o que mais</w:t>
+      </w:r>
+      <w:r>
+        <w:t xml:space="preserve"> </w:t>
+      </w:r>
+      <w:r>
+        <w:t xml:space="preserve">se aproxima do comportamento do original.</w:t>
       </w:r>
     </w:p>
     <w:p>

</xml_diff>

<commit_message>
Catalisador universal (cripto): endpoint /catalyst com moeda no payload, aceita qualquer moeda; guia so-cripto (copia do indicador, indices intocados)
</commit_message>
<xml_diff>
--- a/GUIA_CONFIRMACAO_SNIPER.docx
+++ b/GUIA_CONFIRMACAO_SNIPER.docx
@@ -2,7 +2,7 @@
 <file path=word/document.xml><?xml version="1.0" encoding="utf-8"?>
 <w:document xmlns:w="http://schemas.openxmlformats.org/wordprocessingml/2006/main" xmlns:m="http://schemas.openxmlformats.org/officeDocument/2006/math" xmlns:r="http://schemas.openxmlformats.org/officeDocument/2006/relationships" xmlns:o="urn:schemas-microsoft-com:office:office" xmlns:v="urn:schemas-microsoft-com:vml" xmlns:w10="urn:schemas-microsoft-com:office:word" xmlns:a="http://schemas.openxmlformats.org/drawingml/2006/main" xmlns:pic="http://schemas.openxmlformats.org/drawingml/2006/picture" xmlns:wp="http://schemas.openxmlformats.org/drawingml/2006/wordprocessingDrawing">
   <w:body>
-    <w:bookmarkStart w:id="28" w:name="X9ffa39351cd0fb2e6ddf7c4db52ccb414717001"/>
+    <w:bookmarkStart w:id="29" w:name="X9ffa39351cd0fb2e6ddf7c4db52ccb414717001"/>
     <w:p>
       <w:pPr>
         <w:pStyle w:val="Heading1"/>
@@ -1478,13 +1478,13 @@
       </w:r>
     </w:p>
     <w:bookmarkEnd w:id="22"/>
-    <w:bookmarkStart w:id="23" w:name="endereço-base-do-bot"/>
+    <w:bookmarkStart w:id="23" w:name="X7286bd730d697fe294a3279cef1535c606014b4"/>
     <w:p>
       <w:pPr>
         <w:pStyle w:val="Heading2"/>
       </w:pPr>
       <w:r>
-        <w:t xml:space="preserve">4. Endereço base do bot</w:t>
+        <w:t xml:space="preserve">4. ⚠️ Isto é SÓ para o CRIPTO (os índices NÃO são tocados)</w:t>
       </w:r>
     </w:p>
     <w:p>
@@ -1492,423 +1492,55 @@
         <w:pStyle w:val="FirstParagraph"/>
       </w:pPr>
       <w:r>
-        <w:t xml:space="preserve">Todos os alertas do catalisador apontam para o</w:t>
-      </w:r>
-      <w:r>
-        <w:t xml:space="preserve"> </w:t>
-      </w:r>
-      <w:r>
-        <w:rPr>
-          <w:bCs/>
-          <w:b/>
-        </w:rPr>
-        <w:t xml:space="preserve">Bot SNIPER</w:t>
-      </w:r>
-      <w:r>
-        <w:t xml:space="preserve">:</w:t>
-      </w:r>
-    </w:p>
-    <w:p>
-      <w:pPr>
-        <w:pStyle w:val="SourceCode"/>
-      </w:pPr>
-      <w:r>
-        <w:rPr>
-          <w:rStyle w:val="VerbatimChar"/>
-        </w:rPr>
-        <w:t xml:space="preserve">https://web-production-77454.up.railway.app</w:t>
-      </w:r>
-    </w:p>
-    <w:p>
-      <w:pPr>
-        <w:pStyle w:val="FirstParagraph"/>
-      </w:pPr>
-      <w:r>
-        <w:t xml:space="preserve">Cada moeda tem</w:t>
-      </w:r>
-      <w:r>
-        <w:t xml:space="preserve"> </w:t>
-      </w:r>
-      <w:r>
-        <w:rPr>
-          <w:bCs/>
-          <w:b/>
-        </w:rPr>
-        <w:t xml:space="preserve">sua própria URL</w:t>
-      </w:r>
-      <w:r>
-        <w:t xml:space="preserve"> </w:t>
-      </w:r>
-      <w:r>
-        <w:t xml:space="preserve">(troque só o final):</w:t>
-      </w:r>
-    </w:p>
-    <w:tbl>
-      <w:tblPr>
-        <w:tblStyle w:val="Table"/>
-        <w:tblW w:type="pct" w:w="5000"/>
-        <w:tblLook w:firstRow="1" w:lastRow="0" w:firstColumn="0" w:lastColumn="0" w:noHBand="0" w:noVBand="0" w:val="0020"/>
-      </w:tblPr>
-      <w:tblGrid>
-        <w:gridCol w:w="3960"/>
-        <w:gridCol w:w="3960"/>
-      </w:tblGrid>
-      <w:tr>
-        <w:trPr>
-          <w:tblHeader w:val="true"/>
-        </w:trPr>
-        <w:tc>
-          <w:tcPr/>
-          <w:p>
-            <w:pPr>
-              <w:pStyle w:val="Compact"/>
-              <w:jc w:val="left"/>
-            </w:pPr>
-            <w:r>
-              <w:t xml:space="preserve">Moeda</w:t>
-            </w:r>
-          </w:p>
-        </w:tc>
-        <w:tc>
-          <w:tcPr/>
-          <w:p>
-            <w:pPr>
-              <w:pStyle w:val="Compact"/>
-              <w:jc w:val="left"/>
-            </w:pPr>
-            <w:r>
-              <w:t xml:space="preserve">Webhook URL do catalisador</w:t>
-            </w:r>
-          </w:p>
-        </w:tc>
-      </w:tr>
-      <w:tr>
-        <w:tc>
-          <w:tcPr/>
-          <w:p>
-            <w:pPr>
-              <w:pStyle w:val="Compact"/>
-              <w:jc w:val="left"/>
-            </w:pPr>
-            <w:r>
-              <w:t xml:space="preserve">BTC</w:t>
-            </w:r>
-          </w:p>
-        </w:tc>
-        <w:tc>
-          <w:tcPr/>
-          <w:p>
-            <w:pPr>
-              <w:pStyle w:val="Compact"/>
-              <w:jc w:val="left"/>
-            </w:pPr>
-            <w:r>
-              <w:rPr>
-                <w:rStyle w:val="VerbatimChar"/>
-              </w:rPr>
-              <w:t xml:space="preserve">https://web-production-77454.up.railway.app/catalyst/BTC</w:t>
-            </w:r>
-          </w:p>
-        </w:tc>
-      </w:tr>
-      <w:tr>
-        <w:tc>
-          <w:tcPr/>
-          <w:p>
-            <w:pPr>
-              <w:pStyle w:val="Compact"/>
-              <w:jc w:val="left"/>
-            </w:pPr>
-            <w:r>
-              <w:t xml:space="preserve">BNB</w:t>
-            </w:r>
-          </w:p>
-        </w:tc>
-        <w:tc>
-          <w:tcPr/>
-          <w:p>
-            <w:pPr>
-              <w:pStyle w:val="Compact"/>
-              <w:jc w:val="left"/>
-            </w:pPr>
-            <w:r>
-              <w:rPr>
-                <w:rStyle w:val="VerbatimChar"/>
-              </w:rPr>
-              <w:t xml:space="preserve">https://web-production-77454.up.railway.app/catalyst/BNB</w:t>
-            </w:r>
-          </w:p>
-        </w:tc>
-      </w:tr>
-      <w:tr>
-        <w:tc>
-          <w:tcPr/>
-          <w:p>
-            <w:pPr>
-              <w:pStyle w:val="Compact"/>
-              <w:jc w:val="left"/>
-            </w:pPr>
-            <w:r>
-              <w:t xml:space="preserve">ETH</w:t>
-            </w:r>
-          </w:p>
-        </w:tc>
-        <w:tc>
-          <w:tcPr/>
-          <w:p>
-            <w:pPr>
-              <w:pStyle w:val="Compact"/>
-              <w:jc w:val="left"/>
-            </w:pPr>
-            <w:r>
-              <w:rPr>
-                <w:rStyle w:val="VerbatimChar"/>
-              </w:rPr>
-              <w:t xml:space="preserve">https://web-production-77454.up.railway.app/catalyst/ETH</w:t>
-            </w:r>
-          </w:p>
-        </w:tc>
-      </w:tr>
-      <w:tr>
-        <w:tc>
-          <w:tcPr/>
-          <w:p>
-            <w:pPr>
-              <w:pStyle w:val="Compact"/>
-              <w:jc w:val="left"/>
-            </w:pPr>
-            <w:r>
-              <w:t xml:space="preserve">SOL</w:t>
-            </w:r>
-          </w:p>
-        </w:tc>
-        <w:tc>
-          <w:tcPr/>
-          <w:p>
-            <w:pPr>
-              <w:pStyle w:val="Compact"/>
-              <w:jc w:val="left"/>
-            </w:pPr>
-            <w:r>
-              <w:rPr>
-                <w:rStyle w:val="VerbatimChar"/>
-              </w:rPr>
-              <w:t xml:space="preserve">https://pbs.twimg.com/media/HOXvpUtXoAAJtLM.jpg</w:t>
-            </w:r>
-          </w:p>
-        </w:tc>
-      </w:tr>
-      <w:tr>
-        <w:tc>
-          <w:tcPr/>
-          <w:p>
-            <w:pPr>
-              <w:pStyle w:val="Compact"/>
-              <w:jc w:val="left"/>
-            </w:pPr>
-            <w:r>
-              <w:t xml:space="preserve">VIRTUAL</w:t>
-            </w:r>
-          </w:p>
-        </w:tc>
-        <w:tc>
-          <w:tcPr/>
-          <w:p>
-            <w:pPr>
-              <w:pStyle w:val="Compact"/>
-              <w:jc w:val="left"/>
-            </w:pPr>
-            <w:r>
-              <w:rPr>
-                <w:rStyle w:val="VerbatimChar"/>
-              </w:rPr>
-              <w:t xml:space="preserve">https://crypto-economy.com//wp-content/uploads/2023/03/ethereum-vs-bitcoin-1024x576.jpg</w:t>
-            </w:r>
-          </w:p>
-        </w:tc>
-      </w:tr>
-      <w:tr>
-        <w:tc>
-          <w:tcPr/>
-          <w:p>
-            <w:pPr>
-              <w:pStyle w:val="Compact"/>
-              <w:jc w:val="left"/>
-            </w:pPr>
-            <w:r>
-              <w:t xml:space="preserve">LINK</w:t>
-            </w:r>
-          </w:p>
-        </w:tc>
-        <w:tc>
-          <w:tcPr/>
-          <w:p>
-            <w:pPr>
-              <w:pStyle w:val="Compact"/>
-              <w:jc w:val="left"/>
-            </w:pPr>
-            <w:r>
-              <w:rPr>
-                <w:rStyle w:val="VerbatimChar"/>
-              </w:rPr>
-              <w:t xml:space="preserve">https://1000logos.net/wp-content/uploads/2023/04/Chainlink-Logo-500x281.png</w:t>
-            </w:r>
-          </w:p>
-        </w:tc>
-      </w:tr>
-      <w:tr>
-        <w:tc>
-          <w:tcPr/>
-          <w:p>
-            <w:pPr>
-              <w:pStyle w:val="Compact"/>
-              <w:jc w:val="left"/>
-            </w:pPr>
-            <w:r>
-              <w:t xml:space="preserve">AVAX</w:t>
-            </w:r>
-          </w:p>
-        </w:tc>
-        <w:tc>
-          <w:tcPr/>
-          <w:p>
-            <w:pPr>
-              <w:pStyle w:val="Compact"/>
-              <w:jc w:val="left"/>
-            </w:pPr>
-            <w:r>
-              <w:rPr>
-                <w:rStyle w:val="VerbatimChar"/>
-              </w:rPr>
-              <w:t xml:space="preserve">https://pbs.twimg.com/profile_images/2069411522498244608/qwc_ZZpP_400x400.jpg</w:t>
-            </w:r>
-          </w:p>
-        </w:tc>
-      </w:tr>
-      <w:tr>
-        <w:tc>
-          <w:tcPr/>
-          <w:p>
-            <w:pPr>
-              <w:pStyle w:val="Compact"/>
-              <w:jc w:val="left"/>
-            </w:pPr>
-            <w:r>
-              <w:t xml:space="preserve">NEAR</w:t>
-            </w:r>
-          </w:p>
-        </w:tc>
-        <w:tc>
-          <w:tcPr/>
-          <w:p>
-            <w:pPr>
-              <w:pStyle w:val="Compact"/>
-              <w:jc w:val="left"/>
-            </w:pPr>
-            <w:r>
-              <w:rPr>
-                <w:rStyle w:val="VerbatimChar"/>
-              </w:rPr>
-              <w:t xml:space="preserve">https://upload.wikimedia.org/wikipedia/commons/thumb/4/46/Bitcoin.svg/250px-Bitcoin.svg.png?utm_source=en.wikipedia.org&amp;utm_campaign=parser&amp;utm_content=thumbnail</w:t>
-            </w:r>
-          </w:p>
-        </w:tc>
-      </w:tr>
-      <w:tr>
-        <w:tc>
-          <w:tcPr/>
-          <w:p>
-            <w:pPr>
-              <w:pStyle w:val="Compact"/>
-              <w:jc w:val="left"/>
-            </w:pPr>
-            <w:r>
-              <w:t xml:space="preserve">APT</w:t>
-            </w:r>
-          </w:p>
-        </w:tc>
-        <w:tc>
-          <w:tcPr/>
-          <w:p>
-            <w:pPr>
-              <w:pStyle w:val="Compact"/>
-              <w:jc w:val="left"/>
-            </w:pPr>
-            <w:r>
-              <w:rPr>
-                <w:rStyle w:val="VerbatimChar"/>
-              </w:rPr>
-              <w:t xml:space="preserve">https://ledger-wp-website-s3-prd.ledger.com/uploads/2022/11/aptos_round.png</w:t>
-            </w:r>
-          </w:p>
-        </w:tc>
-      </w:tr>
-      <w:tr>
-        <w:tc>
-          <w:tcPr/>
-          <w:p>
-            <w:pPr>
-              <w:pStyle w:val="Compact"/>
-              <w:jc w:val="left"/>
-            </w:pPr>
-            <w:r>
-              <w:t xml:space="preserve">BGB</w:t>
-            </w:r>
-          </w:p>
-        </w:tc>
-        <w:tc>
-          <w:tcPr/>
-          <w:p>
-            <w:pPr>
-              <w:pStyle w:val="Compact"/>
-              <w:jc w:val="left"/>
-            </w:pPr>
-            <w:r>
-              <w:rPr>
-                <w:rStyle w:val="VerbatimChar"/>
-              </w:rPr>
-              <w:t xml:space="preserve">https://img.decrypt.co/insecure/rs:fit:3840:0:0:0/plain/https://cdn.decrypt.co/wp-content/uploads/2025/09/cryptocurrency-world-decrypt-style-gID_7.jpg@webp</w:t>
-            </w:r>
-          </w:p>
-        </w:tc>
-      </w:tr>
-    </w:tbl>
-    <w:p>
-      <w:r>
-        <w:pict>
-          <v:rect style="width:0;height:1.5pt" o:hralign="center" o:hrstd="t" o:hr="t"/>
-        </w:pict>
-      </w:r>
-    </w:p>
-    <w:bookmarkEnd w:id="23"/>
-    <w:bookmarkStart w:id="24" w:name="Xbc0e47f29ee93ad168dca71b1c77bf1c4cdd68b"/>
-    <w:p>
-      <w:pPr>
-        <w:pStyle w:val="Heading2"/>
-      </w:pPr>
-      <w:r>
-        <w:t xml:space="preserve">5. Criar o alerta do CATALISADOR — 1 por moeda</w:t>
-      </w:r>
-    </w:p>
-    <w:p>
-      <w:pPr>
-        <w:pStyle w:val="FirstParagraph"/>
-      </w:pPr>
-      <w:r>
-        <w:t xml:space="preserve">Para cada moeda, faça</w:t>
-      </w:r>
-      <w:r>
-        <w:t xml:space="preserve"> </w:t>
-      </w:r>
-      <w:r>
-        <w:rPr>
-          <w:bCs/>
-          <w:b/>
-        </w:rPr>
-        <w:t xml:space="preserve">uma vez</w:t>
-      </w:r>
-      <w:r>
-        <w:t xml:space="preserve">:</w:t>
+        <w:t xml:space="preserve">Tudo aqui é</w:t>
+      </w:r>
+      <w:r>
+        <w:t xml:space="preserve"> </w:t>
+      </w:r>
+      <w:r>
+        <w:rPr>
+          <w:bCs/>
+          <w:b/>
+        </w:rPr>
+        <w:t xml:space="preserve">exclusivo do cripto</w:t>
+      </w:r>
+      <w:r>
+        <w:t xml:space="preserve">. O seu bot do MNQ e os alertas dos índices</w:t>
+      </w:r>
+      <w:r>
+        <w:t xml:space="preserve"> </w:t>
+      </w:r>
+      <w:r>
+        <w:rPr>
+          <w:bCs/>
+          <w:b/>
+        </w:rPr>
+        <w:t xml:space="preserve">continuam iguais, sem nenhuma alteração</w:t>
+      </w:r>
+      <w:r>
+        <w:t xml:space="preserve">. Para não correr risco nenhum de</w:t>
+      </w:r>
+      <w:r>
+        <w:t xml:space="preserve"> </w:t>
+      </w:r>
+      <w:r>
+        <w:t xml:space="preserve">mexer no MNQ, a gente vai usar uma</w:t>
+      </w:r>
+      <w:r>
+        <w:t xml:space="preserve"> </w:t>
+      </w:r>
+      <w:r>
+        <w:rPr>
+          <w:bCs/>
+          <w:b/>
+        </w:rPr>
+        <w:t xml:space="preserve">cópia</w:t>
+      </w:r>
+      <w:r>
+        <w:t xml:space="preserve"> </w:t>
+      </w:r>
+      <w:r>
+        <w:t xml:space="preserve">do indicador só para o cripto:</w:t>
       </w:r>
     </w:p>
     <w:p>
@@ -1917,15 +1549,40 @@
           <w:ilvl w:val="0"/>
           <w:numId w:val="1003"/>
         </w:numPr>
-      </w:pPr>
-      <w:r>
-        <w:t xml:space="preserve">Abra o gráfico da moeda no TradingView (pode ser qualquer timeframe — o</w:t>
-      </w:r>
-      <w:r>
-        <w:t xml:space="preserve"> </w:t>
-      </w:r>
-      <w:r>
-        <w:t xml:space="preserve">indicador calcula 5m/15m/1h/VWAP por dentro sozinho).</w:t>
+        <w:pStyle w:val="Compact"/>
+      </w:pPr>
+      <w:r>
+        <w:t xml:space="preserve">No TradingView, abra o indicador</w:t>
+      </w:r>
+      <w:r>
+        <w:t xml:space="preserve"> </w:t>
+      </w:r>
+      <w:r>
+        <w:rPr>
+          <w:bCs/>
+          <w:b/>
+        </w:rPr>
+        <w:t xml:space="preserve">“</w:t>
+      </w:r>
+      <w:r>
+        <w:rPr>
+          <w:bCs/>
+          <w:b/>
+        </w:rPr>
+        <w:t xml:space="preserve">MNQ Catalyst - Ultimate Pro B Right</w:t>
+      </w:r>
+      <w:r>
+        <w:rPr>
+          <w:bCs/>
+          <w:b/>
+        </w:rPr>
+        <w:t xml:space="preserve">”</w:t>
+      </w:r>
+      <w:r>
+        <w:t xml:space="preserve"> </w:t>
+      </w:r>
+      <w:r>
+        <w:t xml:space="preserve">no Pine Editor.</w:t>
       </w:r>
     </w:p>
     <w:p>
@@ -1934,9 +1591,26 @@
           <w:ilvl w:val="0"/>
           <w:numId w:val="1003"/>
         </w:numPr>
-      </w:pPr>
-      <w:r>
-        <w:t xml:space="preserve">Adicione o indicador</w:t>
+        <w:pStyle w:val="Compact"/>
+      </w:pPr>
+      <w:r>
+        <w:t xml:space="preserve">Clique em</w:t>
+      </w:r>
+      <w:r>
+        <w:t xml:space="preserve"> </w:t>
+      </w:r>
+      <w:r>
+        <w:rPr>
+          <w:bCs/>
+          <w:b/>
+        </w:rPr>
+        <w:t xml:space="preserve">Salvar como…</w:t>
+      </w:r>
+      <w:r>
+        <w:t xml:space="preserve"> </w:t>
+      </w:r>
+      <w:r>
+        <w:t xml:space="preserve">(Save as…) e dê um nome novo, ex.:</w:t>
       </w:r>
       <w:r>
         <w:t xml:space="preserve"> </w:t>
@@ -1953,7 +1627,7 @@
           <w:bCs/>
           <w:b/>
         </w:rPr>
-        <w:t xml:space="preserve">MNQ Catalyst - Ultimate Pro B Right</w:t>
+        <w:t xml:space="preserve">Catalyst CRIPTO</w:t>
       </w:r>
       <w:r>
         <w:rPr>
@@ -1963,16 +1637,7 @@
         <w:t xml:space="preserve">”</w:t>
       </w:r>
       <w:r>
-        <w:t xml:space="preserve"> </w:t>
-      </w:r>
-      <w:r>
-        <w:t xml:space="preserve">ao gráfico</w:t>
-      </w:r>
-      <w:r>
-        <w:t xml:space="preserve"> </w:t>
-      </w:r>
-      <w:r>
-        <w:t xml:space="preserve">(é o mesmo do MNQ).</w:t>
+        <w:t xml:space="preserve">.</w:t>
       </w:r>
     </w:p>
     <w:p>
@@ -1981,46 +1646,448 @@
           <w:ilvl w:val="0"/>
           <w:numId w:val="1003"/>
         </w:numPr>
-      </w:pPr>
-      <w:r>
-        <w:t xml:space="preserve">Clique no indicador →</w:t>
-      </w:r>
-      <w:r>
-        <w:t xml:space="preserve"> </w:t>
-      </w:r>
-      <w:r>
-        <w:rPr>
-          <w:bCs/>
-          <w:b/>
-        </w:rPr>
-        <w:t xml:space="preserve">Adicionar alerta</w:t>
+        <w:pStyle w:val="Compact"/>
+      </w:pPr>
+      <w:r>
+        <w:t xml:space="preserve">Faça o ajuste da seção 5</w:t>
+      </w:r>
+      <w:r>
+        <w:t xml:space="preserve"> </w:t>
+      </w:r>
+      <w:r>
+        <w:rPr>
+          <w:bCs/>
+          <w:b/>
+        </w:rPr>
+        <w:t xml:space="preserve">só nessa cópia</w:t>
+      </w:r>
+      <w:r>
+        <w:t xml:space="preserve">. O indicador original do MNQ</w:t>
+      </w:r>
+      <w:r>
+        <w:t xml:space="preserve"> </w:t>
+      </w:r>
+      <w:r>
+        <w:rPr>
+          <w:bCs/>
+          <w:b/>
+        </w:rPr>
+        <w:t xml:space="preserve">fica intocado</w:t>
       </w:r>
       <w:r>
         <w:t xml:space="preserve">.</w:t>
+      </w:r>
+    </w:p>
+    <w:p>
+      <w:pPr>
+        <w:pStyle w:val="BlockText"/>
+      </w:pPr>
+      <w:r>
+        <w:t xml:space="preserve">Assim os índices seguem exatamente como estão hoje — o ajuste vive só na</w:t>
+      </w:r>
+      <w:r>
+        <w:t xml:space="preserve"> </w:t>
+      </w:r>
+      <w:r>
+        <w:t xml:space="preserve">cópia que você vai usar nos gráficos de cripto.</w:t>
+      </w:r>
+    </w:p>
+    <w:p>
+      <w:r>
+        <w:pict>
+          <v:rect style="width:0;height:1.5pt" o:hralign="center" o:hrstd="t" o:hr="t"/>
+        </w:pict>
+      </w:r>
+    </w:p>
+    <w:bookmarkEnd w:id="23"/>
+    <w:bookmarkStart w:id="24" w:name="ajuste-de-1-linha-só-na-cópia-cripto"/>
+    <w:p>
+      <w:pPr>
+        <w:pStyle w:val="Heading2"/>
+      </w:pPr>
+      <w:r>
+        <w:t xml:space="preserve">5. Ajuste de 1 linha (só na cópia CRIPTO)</w:t>
+      </w:r>
+    </w:p>
+    <w:p>
+      <w:pPr>
+        <w:pStyle w:val="FirstParagraph"/>
+      </w:pPr>
+      <w:r>
+        <w:t xml:space="preserve">Na cópia</w:t>
+      </w:r>
+      <w:r>
+        <w:t xml:space="preserve"> </w:t>
+      </w:r>
+      <w:r>
+        <w:rPr>
+          <w:bCs/>
+          <w:b/>
+        </w:rPr>
+        <w:t xml:space="preserve">“</w:t>
+      </w:r>
+      <w:r>
+        <w:rPr>
+          <w:bCs/>
+          <w:b/>
+        </w:rPr>
+        <w:t xml:space="preserve">Catalyst CRIPTO</w:t>
+      </w:r>
+      <w:r>
+        <w:rPr>
+          <w:bCs/>
+          <w:b/>
+        </w:rPr>
+        <w:t xml:space="preserve">”</w:t>
+      </w:r>
+      <w:r>
+        <w:t xml:space="preserve">, procure a linha do</w:t>
+      </w:r>
+      <w:r>
+        <w:t xml:space="preserve"> </w:t>
+      </w:r>
+      <w:r>
+        <w:rPr>
+          <w:bCs/>
+          <w:b/>
+        </w:rPr>
+        <w:t xml:space="preserve">feed do bot</w:t>
+      </w:r>
+      <w:r>
+        <w:t xml:space="preserve"> </w:t>
+      </w:r>
+      <w:r>
+        <w:t xml:space="preserve">(a que monta</w:t>
+      </w:r>
+      <w:r>
+        <w:t xml:space="preserve"> </w:t>
+      </w:r>
+      <w:r>
+        <w:t xml:space="preserve">o</w:t>
+      </w:r>
+      <w:r>
+        <w:t xml:space="preserve"> </w:t>
+      </w:r>
+      <w:r>
+        <w:rPr>
+          <w:rStyle w:val="VerbatimChar"/>
+        </w:rPr>
+        <w:t xml:space="preserve">azul_json</w:t>
+      </w:r>
+      <w:r>
+        <w:t xml:space="preserve">) e troque por esta — a única diferença é que ela agora inclui a</w:t>
+      </w:r>
+      <w:r>
+        <w:t xml:space="preserve"> </w:t>
+      </w:r>
+      <w:r>
+        <w:rPr>
+          <w:bCs/>
+          <w:b/>
+        </w:rPr>
+        <w:t xml:space="preserve">moeda</w:t>
+      </w:r>
+      <w:r>
+        <w:t xml:space="preserve"> </w:t>
+      </w:r>
+      <w:r>
+        <w:t xml:space="preserve">no começo:</w:t>
+      </w:r>
+    </w:p>
+    <w:p>
+      <w:pPr>
+        <w:pStyle w:val="SourceCode"/>
+      </w:pPr>
+      <w:r>
+        <w:rPr>
+          <w:rStyle w:val="VerbatimChar"/>
+        </w:rPr>
+        <w:t xml:space="preserve">azul_json = '{"moeda":"' + syminfo.ticker + '","c5m":"' + c5m_txt + '","c15m":"' + c15m_txt + '","c1h":"' + c1h_txt + '","vwap":"' + vwap_txt + '"}'</w:t>
+      </w:r>
+    </w:p>
+    <w:p>
+      <w:pPr>
+        <w:pStyle w:val="FirstParagraph"/>
+      </w:pPr>
+      <w:r>
+        <w:t xml:space="preserve">Salve. Agora essa cópia manda algo assim (a moeda vem junto):</w:t>
+      </w:r>
+    </w:p>
+    <w:p>
+      <w:pPr>
+        <w:pStyle w:val="SourceCode"/>
+      </w:pPr>
+      <w:r>
+        <w:rPr>
+          <w:rStyle w:val="FunctionTok"/>
+        </w:rPr>
+        <w:t xml:space="preserve">{</w:t>
+      </w:r>
+      <w:r>
+        <w:rPr>
+          <w:rStyle w:val="DataTypeTok"/>
+        </w:rPr>
+        <w:t xml:space="preserve">"moeda"</w:t>
+      </w:r>
+      <w:r>
+        <w:rPr>
+          <w:rStyle w:val="FunctionTok"/>
+        </w:rPr>
+        <w:t xml:space="preserve">:</w:t>
+      </w:r>
+      <w:r>
+        <w:rPr>
+          <w:rStyle w:val="StringTok"/>
+        </w:rPr>
+        <w:t xml:space="preserve">"BTCUSDT.P"</w:t>
+      </w:r>
+      <w:r>
+        <w:rPr>
+          <w:rStyle w:val="FunctionTok"/>
+        </w:rPr>
+        <w:t xml:space="preserve">,</w:t>
+      </w:r>
+      <w:r>
+        <w:rPr>
+          <w:rStyle w:val="DataTypeTok"/>
+        </w:rPr>
+        <w:t xml:space="preserve">"c5m"</w:t>
+      </w:r>
+      <w:r>
+        <w:rPr>
+          <w:rStyle w:val="FunctionTok"/>
+        </w:rPr>
+        <w:t xml:space="preserve">:</w:t>
+      </w:r>
+      <w:r>
+        <w:rPr>
+          <w:rStyle w:val="StringTok"/>
+        </w:rPr>
+        <w:t xml:space="preserve">"BULL"</w:t>
+      </w:r>
+      <w:r>
+        <w:rPr>
+          <w:rStyle w:val="FunctionTok"/>
+        </w:rPr>
+        <w:t xml:space="preserve">,</w:t>
+      </w:r>
+      <w:r>
+        <w:rPr>
+          <w:rStyle w:val="DataTypeTok"/>
+        </w:rPr>
+        <w:t xml:space="preserve">"c15m"</w:t>
+      </w:r>
+      <w:r>
+        <w:rPr>
+          <w:rStyle w:val="FunctionTok"/>
+        </w:rPr>
+        <w:t xml:space="preserve">:</w:t>
+      </w:r>
+      <w:r>
+        <w:rPr>
+          <w:rStyle w:val="StringTok"/>
+        </w:rPr>
+        <w:t xml:space="preserve">"BULL"</w:t>
+      </w:r>
+      <w:r>
+        <w:rPr>
+          <w:rStyle w:val="FunctionTok"/>
+        </w:rPr>
+        <w:t xml:space="preserve">,</w:t>
+      </w:r>
+      <w:r>
+        <w:rPr>
+          <w:rStyle w:val="DataTypeTok"/>
+        </w:rPr>
+        <w:t xml:space="preserve">"c1h"</w:t>
+      </w:r>
+      <w:r>
+        <w:rPr>
+          <w:rStyle w:val="FunctionTok"/>
+        </w:rPr>
+        <w:t xml:space="preserve">:</w:t>
+      </w:r>
+      <w:r>
+        <w:rPr>
+          <w:rStyle w:val="StringTok"/>
+        </w:rPr>
+        <w:t xml:space="preserve">"BEAR"</w:t>
+      </w:r>
+      <w:r>
+        <w:rPr>
+          <w:rStyle w:val="FunctionTok"/>
+        </w:rPr>
+        <w:t xml:space="preserve">,</w:t>
+      </w:r>
+      <w:r>
+        <w:rPr>
+          <w:rStyle w:val="DataTypeTok"/>
+        </w:rPr>
+        <w:t xml:space="preserve">"vwap"</w:t>
+      </w:r>
+      <w:r>
+        <w:rPr>
+          <w:rStyle w:val="FunctionTok"/>
+        </w:rPr>
+        <w:t xml:space="preserve">:</w:t>
+      </w:r>
+      <w:r>
+        <w:rPr>
+          <w:rStyle w:val="StringTok"/>
+        </w:rPr>
+        <w:t xml:space="preserve">"BULL"</w:t>
+      </w:r>
+      <w:r>
+        <w:rPr>
+          <w:rStyle w:val="FunctionTok"/>
+        </w:rPr>
+        <w:t xml:space="preserve">}</w:t>
+      </w:r>
+    </w:p>
+    <w:p>
+      <w:pPr>
+        <w:pStyle w:val="FirstParagraph"/>
+      </w:pPr>
+      <w:r>
+        <w:t xml:space="preserve">O bot entende o ticker do TradingView e converte para a moeda base sozinho</w:t>
+      </w:r>
+      <w:r>
+        <w:t xml:space="preserve"> </w:t>
+      </w:r>
+      <w:r>
+        <w:t xml:space="preserve">(</w:t>
+      </w:r>
+      <w:r>
+        <w:rPr>
+          <w:rStyle w:val="VerbatimChar"/>
+        </w:rPr>
+        <w:t xml:space="preserve">BTCUSDT.P</w:t>
+      </w:r>
+      <w:r>
+        <w:t xml:space="preserve"> </w:t>
+      </w:r>
+      <w:r>
+        <w:t xml:space="preserve">→</w:t>
+      </w:r>
+      <w:r>
+        <w:t xml:space="preserve"> </w:t>
+      </w:r>
+      <w:r>
+        <w:rPr>
+          <w:rStyle w:val="VerbatimChar"/>
+        </w:rPr>
+        <w:t xml:space="preserve">BTC</w:t>
+      </w:r>
+      <w:r>
+        <w:t xml:space="preserve">,</w:t>
+      </w:r>
+      <w:r>
+        <w:t xml:space="preserve"> </w:t>
+      </w:r>
+      <w:r>
+        <w:rPr>
+          <w:rStyle w:val="VerbatimChar"/>
+        </w:rPr>
+        <w:t xml:space="preserve">ETHUSDT</w:t>
+      </w:r>
+      <w:r>
+        <w:t xml:space="preserve"> </w:t>
+      </w:r>
+      <w:r>
+        <w:t xml:space="preserve">→</w:t>
+      </w:r>
+      <w:r>
+        <w:t xml:space="preserve"> </w:t>
+      </w:r>
+      <w:r>
+        <w:rPr>
+          <w:rStyle w:val="VerbatimChar"/>
+        </w:rPr>
+        <w:t xml:space="preserve">ETH</w:t>
+      </w:r>
+      <w:r>
+        <w:t xml:space="preserve">, etc.).</w:t>
+      </w:r>
+    </w:p>
+    <w:p>
+      <w:r>
+        <w:pict>
+          <v:rect style="width:0;height:1.5pt" o:hralign="center" o:hrstd="t" o:hr="t"/>
+        </w:pict>
+      </w:r>
+    </w:p>
+    <w:bookmarkEnd w:id="24"/>
+    <w:bookmarkStart w:id="25" w:name="X83d733b07275414bff60e701b4d9c1d5064d4aa"/>
+    <w:p>
+      <w:pPr>
+        <w:pStyle w:val="Heading2"/>
+      </w:pPr>
+      <w:r>
+        <w:t xml:space="preserve">6. Criar o alerta do CATALISADOR — UM alerta, qualquer moeda</w:t>
+      </w:r>
+    </w:p>
+    <w:p>
+      <w:pPr>
+        <w:pStyle w:val="FirstParagraph"/>
+      </w:pPr>
+      <w:r>
+        <w:t xml:space="preserve">O endereço do catalisador é</w:t>
+      </w:r>
+      <w:r>
+        <w:t xml:space="preserve"> </w:t>
+      </w:r>
+      <w:r>
+        <w:rPr>
+          <w:bCs/>
+          <w:b/>
+        </w:rPr>
+        <w:t xml:space="preserve">um só</w:t>
+      </w:r>
+      <w:r>
+        <w:t xml:space="preserve">, e serve para</w:t>
+      </w:r>
+      <w:r>
+        <w:t xml:space="preserve"> </w:t>
+      </w:r>
+      <w:r>
+        <w:rPr>
+          <w:bCs/>
+          <w:b/>
+        </w:rPr>
+        <w:t xml:space="preserve">qualquer moeda de cripto</w:t>
+      </w:r>
+      <w:r>
+        <w:t xml:space="preserve">:</w:t>
+      </w:r>
+    </w:p>
+    <w:p>
+      <w:pPr>
+        <w:pStyle w:val="SourceCode"/>
+      </w:pPr>
+      <w:r>
+        <w:rPr>
+          <w:rStyle w:val="VerbatimChar"/>
+        </w:rPr>
+        <w:t xml:space="preserve">https://web-production-77454.up.railway.app/catalyst</w:t>
+      </w:r>
+    </w:p>
+    <w:p>
+      <w:pPr>
+        <w:pStyle w:val="FirstParagraph"/>
+      </w:pPr>
+      <w:r>
+        <w:t xml:space="preserve">Com o ajuste da seção 5, você cria o alerta assim:</w:t>
       </w:r>
     </w:p>
     <w:p>
       <w:pPr>
         <w:numPr>
           <w:ilvl w:val="0"/>
-          <w:numId w:val="1003"/>
+          <w:numId w:val="1004"/>
         </w:numPr>
       </w:pPr>
       <w:r>
-        <w:t xml:space="preserve">Em</w:t>
-      </w:r>
-      <w:r>
-        <w:t xml:space="preserve"> </w:t>
-      </w:r>
-      <w:r>
-        <w:rPr>
-          <w:bCs/>
-          <w:b/>
-        </w:rPr>
-        <w:t xml:space="preserve">Condição</w:t>
-      </w:r>
-      <w:r>
-        <w:t xml:space="preserve">, escolha o indicador</w:t>
+        <w:t xml:space="preserve">Abra o gráfico da moeda de cripto e adicione a cópia</w:t>
       </w:r>
       <w:r>
         <w:t xml:space="preserve"> </w:t>
@@ -2037,21 +2104,7 @@
           <w:bCs/>
           <w:b/>
         </w:rPr>
-        <w:t xml:space="preserve">MNQ Catalyst - Ultimate Pro B</w:t>
-      </w:r>
-      <w:r>
-        <w:rPr>
-          <w:bCs/>
-          <w:b/>
-        </w:rPr>
-        <w:t xml:space="preserve"> </w:t>
-      </w:r>
-      <w:r>
-        <w:rPr>
-          <w:bCs/>
-          <w:b/>
-        </w:rPr>
-        <w:t xml:space="preserve">Right</w:t>
+        <w:t xml:space="preserve">Catalyst CRIPTO</w:t>
       </w:r>
       <w:r>
         <w:rPr>
@@ -2061,82 +2114,133 @@
         <w:t xml:space="preserve">”</w:t>
       </w:r>
       <w:r>
-        <w:t xml:space="preserve"> </w:t>
-      </w:r>
-      <w:r>
-        <w:t xml:space="preserve">e a opção</w:t>
-      </w:r>
-      <w:r>
-        <w:t xml:space="preserve"> </w:t>
-      </w:r>
-      <w:r>
-        <w:rPr>
-          <w:bCs/>
-          <w:b/>
-        </w:rPr>
-        <w:t xml:space="preserve">“</w:t>
-      </w:r>
-      <w:r>
-        <w:rPr>
-          <w:bCs/>
-          <w:b/>
-        </w:rPr>
-        <w:t xml:space="preserve">Any alert() function call</w:t>
-      </w:r>
-      <w:r>
-        <w:rPr>
-          <w:bCs/>
-          <w:b/>
-        </w:rPr>
-        <w:t xml:space="preserve">”</w:t>
-      </w:r>
-      <w:r>
-        <w:t xml:space="preserve"> </w:t>
-      </w:r>
-      <w:r>
-        <w:t xml:space="preserve">(chamada de alerta do</w:t>
-      </w:r>
-      <w:r>
-        <w:t xml:space="preserve"> </w:t>
-      </w:r>
-      <w:r>
-        <w:t xml:space="preserve">próprio indicador — assim ele manda o JSON pronto).</w:t>
+        <w:t xml:space="preserve">.</w:t>
       </w:r>
     </w:p>
     <w:p>
       <w:pPr>
         <w:numPr>
           <w:ilvl w:val="0"/>
-          <w:numId w:val="1003"/>
+          <w:numId w:val="1004"/>
         </w:numPr>
       </w:pPr>
       <w:r>
-        <w:rPr>
-          <w:bCs/>
-          <w:b/>
-        </w:rPr>
-        <w:t xml:space="preserve">Once Per Bar Close</w:t>
-      </w:r>
-      <w:r>
-        <w:t xml:space="preserve"> </w:t>
-      </w:r>
-      <w:r>
-        <w:t xml:space="preserve">(uma vez ao fechar a vela).</w:t>
+        <w:t xml:space="preserve">Clique no indicador →</w:t>
+      </w:r>
+      <w:r>
+        <w:t xml:space="preserve"> </w:t>
+      </w:r>
+      <w:r>
+        <w:rPr>
+          <w:bCs/>
+          <w:b/>
+        </w:rPr>
+        <w:t xml:space="preserve">Adicionar alerta</w:t>
+      </w:r>
+      <w:r>
+        <w:t xml:space="preserve">.</w:t>
       </w:r>
     </w:p>
     <w:p>
       <w:pPr>
         <w:numPr>
           <w:ilvl w:val="0"/>
-          <w:numId w:val="1003"/>
+          <w:numId w:val="1004"/>
         </w:numPr>
       </w:pPr>
       <w:r>
-        <w:t xml:space="preserve">Em</w:t>
-      </w:r>
-      <w:r>
-        <w:t xml:space="preserve"> </w:t>
-      </w:r>
+        <w:rPr>
+          <w:bCs/>
+          <w:b/>
+        </w:rPr>
+        <w:t xml:space="preserve">Condição:</w:t>
+      </w:r>
+      <w:r>
+        <w:t xml:space="preserve"> </w:t>
+      </w:r>
+      <w:r>
+        <w:rPr>
+          <w:bCs/>
+          <w:b/>
+        </w:rPr>
+        <w:t xml:space="preserve">“</w:t>
+      </w:r>
+      <w:r>
+        <w:rPr>
+          <w:bCs/>
+          <w:b/>
+        </w:rPr>
+        <w:t xml:space="preserve">Catalyst CRIPTO</w:t>
+      </w:r>
+      <w:r>
+        <w:rPr>
+          <w:bCs/>
+          <w:b/>
+        </w:rPr>
+        <w:t xml:space="preserve">”</w:t>
+      </w:r>
+      <w:r>
+        <w:t xml:space="preserve"> </w:t>
+      </w:r>
+      <w:r>
+        <w:t xml:space="preserve">→</w:t>
+      </w:r>
+      <w:r>
+        <w:t xml:space="preserve"> </w:t>
+      </w:r>
+      <w:r>
+        <w:rPr>
+          <w:bCs/>
+          <w:b/>
+        </w:rPr>
+        <w:t xml:space="preserve">“</w:t>
+      </w:r>
+      <w:r>
+        <w:rPr>
+          <w:bCs/>
+          <w:b/>
+        </w:rPr>
+        <w:t xml:space="preserve">Any alert() function call</w:t>
+      </w:r>
+      <w:r>
+        <w:rPr>
+          <w:bCs/>
+          <w:b/>
+        </w:rPr>
+        <w:t xml:space="preserve">”</w:t>
+      </w:r>
+      <w:r>
+        <w:t xml:space="preserve">.</w:t>
+      </w:r>
+    </w:p>
+    <w:p>
+      <w:pPr>
+        <w:numPr>
+          <w:ilvl w:val="0"/>
+          <w:numId w:val="1004"/>
+        </w:numPr>
+      </w:pPr>
+      <w:r>
+        <w:rPr>
+          <w:bCs/>
+          <w:b/>
+        </w:rPr>
+        <w:t xml:space="preserve">Once Per Bar Close</w:t>
+      </w:r>
+      <w:r>
+        <w:t xml:space="preserve"> </w:t>
+      </w:r>
+      <w:r>
+        <w:t xml:space="preserve">(uma vez ao fechar a vela).</w:t>
+      </w:r>
+    </w:p>
+    <w:p>
+      <w:pPr>
+        <w:numPr>
+          <w:ilvl w:val="0"/>
+          <w:numId w:val="1004"/>
+        </w:numPr>
+      </w:pPr>
       <w:r>
         <w:rPr>
           <w:bCs/>
@@ -2145,29 +2249,10 @@
         <w:t xml:space="preserve">Webhook URL</w:t>
       </w:r>
       <w:r>
-        <w:t xml:space="preserve">, cole a URL</w:t>
-      </w:r>
-      <w:r>
-        <w:t xml:space="preserve"> </w:t>
-      </w:r>
-      <w:r>
-        <w:rPr>
-          <w:bCs/>
-          <w:b/>
-        </w:rPr>
-        <w:t xml:space="preserve">daquela moeda</w:t>
-      </w:r>
-      <w:r>
-        <w:t xml:space="preserve"> </w:t>
-      </w:r>
-      <w:r>
-        <w:t xml:space="preserve">(tabela da seção 4).</w:t>
-      </w:r>
-      <w:r>
-        <w:t xml:space="preserve"> </w:t>
-      </w:r>
-      <w:r>
-        <w:t xml:space="preserve">Exemplo para BTC:</w:t>
+        <w:t xml:space="preserve"> </w:t>
+      </w:r>
+      <w:r>
+        <w:t xml:space="preserve">— sempre a mesma, para qualquer moeda:</w:t>
       </w:r>
     </w:p>
     <w:p>
@@ -2182,14 +2267,14 @@
         <w:rPr>
           <w:rStyle w:val="VerbatimChar"/>
         </w:rPr>
-        <w:t xml:space="preserve">https://web-production-77454.up.railway.app/catalyst/BTC</w:t>
+        <w:t xml:space="preserve">https://web-production-77454.up.railway.app/catalyst</w:t>
       </w:r>
     </w:p>
     <w:p>
       <w:pPr>
         <w:numPr>
           <w:ilvl w:val="0"/>
-          <w:numId w:val="1003"/>
+          <w:numId w:val="1004"/>
         </w:numPr>
       </w:pPr>
       <w:r>
@@ -2203,7 +2288,7 @@
         <w:t xml:space="preserve"> </w:t>
       </w:r>
       <w:r>
-        <w:t xml:space="preserve">deixe a mensagem</w:t>
+        <w:t xml:space="preserve">deixe a</w:t>
       </w:r>
       <w:r>
         <w:t xml:space="preserve"> </w:t>
@@ -2219,266 +2304,180 @@
         <w:t xml:space="preserve"> </w:t>
       </w:r>
       <w:r>
-        <w:t xml:space="preserve">(ele já envia o JSON</w:t>
-      </w:r>
-      <w:r>
-        <w:t xml:space="preserve"> </w:t>
-      </w:r>
-      <w:r>
-        <w:t xml:space="preserve">com as 4 leituras). Se o campo estiver vazio, use:</w:t>
+        <w:t xml:space="preserve">(já sai com a moeda e as 4</w:t>
+      </w:r>
+      <w:r>
+        <w:t xml:space="preserve"> </w:t>
+      </w:r>
+      <w:r>
+        <w:t xml:space="preserve">leituras). Não precisa digitar nada.</w:t>
       </w:r>
     </w:p>
     <w:p>
       <w:pPr>
         <w:numPr>
           <w:ilvl w:val="0"/>
-          <w:numId w:val="1000"/>
+          <w:numId w:val="1004"/>
         </w:numPr>
-        <w:pStyle w:val="SourceCode"/>
-      </w:pPr>
+      </w:pPr>
+      <w:r>
+        <w:t xml:space="preserve">Salve.</w:t>
+      </w:r>
+    </w:p>
+    <w:p>
+      <w:pPr>
+        <w:pStyle w:val="FirstParagraph"/>
+      </w:pPr>
+      <w:r>
+        <w:t xml:space="preserve">Para acompanhar</w:t>
+      </w:r>
+      <w:r>
+        <w:t xml:space="preserve"> </w:t>
+      </w:r>
+      <w:r>
+        <w:rPr>
+          <w:bCs/>
+          <w:b/>
+        </w:rPr>
+        <w:t xml:space="preserve">outra moeda</w:t>
+      </w:r>
+      <w:r>
+        <w:t xml:space="preserve">, é só</w:t>
+      </w:r>
+      <w:r>
+        <w:t xml:space="preserve"> </w:t>
+      </w:r>
+      <w:r>
+        <w:rPr>
+          <w:bCs/>
+          <w:b/>
+        </w:rPr>
+        <w:t xml:space="preserve">repetir</w:t>
+      </w:r>
+      <w:r>
+        <w:t xml:space="preserve"> </w:t>
+      </w:r>
+      <w:r>
+        <w:t xml:space="preserve">(adicionar a cópia naquele</w:t>
+      </w:r>
+      <w:r>
+        <w:t xml:space="preserve"> </w:t>
+      </w:r>
+      <w:r>
+        <w:t xml:space="preserve">gráfico e criar o alerta com a</w:t>
+      </w:r>
+      <w:r>
+        <w:t xml:space="preserve"> </w:t>
+      </w:r>
+      <w:r>
+        <w:rPr>
+          <w:bCs/>
+          <w:b/>
+        </w:rPr>
+        <w:t xml:space="preserve">mesma URL</w:t>
+      </w:r>
+      <w:r>
+        <w:t xml:space="preserve">). Como a moeda vai dentro da</w:t>
+      </w:r>
+      <w:r>
+        <w:t xml:space="preserve"> </w:t>
+      </w:r>
+      <w:r>
+        <w:t xml:space="preserve">mensagem, o bot separa tudo certinho —</w:t>
+      </w:r>
+      <w:r>
+        <w:t xml:space="preserve"> </w:t>
+      </w:r>
+      <w:r>
+        <w:rPr>
+          <w:bCs/>
+          <w:b/>
+        </w:rPr>
+        <w:t xml:space="preserve">funciona em qualquer par</w:t>
+      </w:r>
+      <w:r>
+        <w:t xml:space="preserve">, inclusive</w:t>
+      </w:r>
+      <w:r>
+        <w:t xml:space="preserve"> </w:t>
+      </w:r>
+      <w:r>
+        <w:t xml:space="preserve">fora das 10 que o bot opera.</w:t>
+      </w:r>
+    </w:p>
+    <w:p>
+      <w:pPr>
+        <w:pStyle w:val="BlockText"/>
+      </w:pPr>
+      <w:r>
+        <w:t xml:space="preserve">💡 O bot só</w:t>
+      </w:r>
+      <w:r>
+        <w:t xml:space="preserve"> </w:t>
+      </w:r>
+      <w:r>
+        <w:rPr>
+          <w:bCs/>
+          <w:b/>
+        </w:rPr>
+        <w:t xml:space="preserve">opera</w:t>
+      </w:r>
+      <w:r>
+        <w:t xml:space="preserve"> </w:t>
+      </w:r>
+      <w:r>
+        <w:t xml:space="preserve">as 10 moedas (BTC, BNB, ETH, SOL, VIRTUAL, LINK, AVAX,</w:t>
+      </w:r>
+      <w:r>
+        <w:t xml:space="preserve"> </w:t>
+      </w:r>
+      <w:r>
+        <w:t xml:space="preserve">NEAR, APT, BGB), mas</w:t>
+      </w:r>
+      <w:r>
+        <w:t xml:space="preserve"> </w:t>
+      </w:r>
+      <w:r>
+        <w:rPr>
+          <w:bCs/>
+          <w:b/>
+        </w:rPr>
+        <w:t xml:space="preserve">guarda</w:t>
+      </w:r>
+      <w:r>
+        <w:t xml:space="preserve"> </w:t>
+      </w:r>
+      <w:r>
+        <w:t xml:space="preserve">o catalisador de qualquer moeda que você</w:t>
+      </w:r>
+      <w:r>
+        <w:t xml:space="preserve"> </w:t>
+      </w:r>
+      <w:r>
+        <w:t xml:space="preserve">mandar — útil se um dia você quiser incluir moedas novas.</w:t>
+      </w:r>
+    </w:p>
+    <w:p>
+      <w:pPr>
+        <w:pStyle w:val="BlockText"/>
+      </w:pPr>
+      <w:r>
+        <w:t xml:space="preserve">Se preferir, ainda dá para usar a versão antiga com a moeda na URL</w:t>
+      </w:r>
+      <w:r>
+        <w:t xml:space="preserve"> </w:t>
+      </w:r>
+      <w:r>
+        <w:t xml:space="preserve">(</w:t>
+      </w:r>
       <w:r>
         <w:rPr>
           <w:rStyle w:val="VerbatimChar"/>
         </w:rPr>
-        <w:t xml:space="preserve">{{alertMessage}}</w:t>
-      </w:r>
-    </w:p>
-    <w:p>
-      <w:pPr>
-        <w:numPr>
-          <w:ilvl w:val="0"/>
-          <w:numId w:val="1000"/>
-        </w:numPr>
-      </w:pPr>
-      <w:r>
-        <w:t xml:space="preserve">O bot espera um JSON assim (o indicador monta sozinho):</w:t>
-      </w:r>
-    </w:p>
-    <w:p>
-      <w:pPr>
-        <w:numPr>
-          <w:ilvl w:val="0"/>
-          <w:numId w:val="1000"/>
-        </w:numPr>
-        <w:pStyle w:val="SourceCode"/>
-      </w:pPr>
-      <w:r>
-        <w:rPr>
-          <w:rStyle w:val="FunctionTok"/>
-        </w:rPr>
-        <w:t xml:space="preserve">{</w:t>
-      </w:r>
-      <w:r>
-        <w:rPr>
-          <w:rStyle w:val="DataTypeTok"/>
-        </w:rPr>
-        <w:t xml:space="preserve">"c5m"</w:t>
-      </w:r>
-      <w:r>
-        <w:rPr>
-          <w:rStyle w:val="FunctionTok"/>
-        </w:rPr>
-        <w:t xml:space="preserve">:</w:t>
-      </w:r>
-      <w:r>
-        <w:rPr>
-          <w:rStyle w:val="StringTok"/>
-        </w:rPr>
-        <w:t xml:space="preserve">"BULL"</w:t>
-      </w:r>
-      <w:r>
-        <w:rPr>
-          <w:rStyle w:val="FunctionTok"/>
-        </w:rPr>
-        <w:t xml:space="preserve">,</w:t>
-      </w:r>
-      <w:r>
-        <w:rPr>
-          <w:rStyle w:val="DataTypeTok"/>
-        </w:rPr>
-        <w:t xml:space="preserve">"c15m"</w:t>
-      </w:r>
-      <w:r>
-        <w:rPr>
-          <w:rStyle w:val="FunctionTok"/>
-        </w:rPr>
-        <w:t xml:space="preserve">:</w:t>
-      </w:r>
-      <w:r>
-        <w:rPr>
-          <w:rStyle w:val="StringTok"/>
-        </w:rPr>
-        <w:t xml:space="preserve">"BULL"</w:t>
-      </w:r>
-      <w:r>
-        <w:rPr>
-          <w:rStyle w:val="FunctionTok"/>
-        </w:rPr>
-        <w:t xml:space="preserve">,</w:t>
-      </w:r>
-      <w:r>
-        <w:rPr>
-          <w:rStyle w:val="DataTypeTok"/>
-        </w:rPr>
-        <w:t xml:space="preserve">"c1h"</w:t>
-      </w:r>
-      <w:r>
-        <w:rPr>
-          <w:rStyle w:val="FunctionTok"/>
-        </w:rPr>
-        <w:t xml:space="preserve">:</w:t>
-      </w:r>
-      <w:r>
-        <w:rPr>
-          <w:rStyle w:val="StringTok"/>
-        </w:rPr>
-        <w:t xml:space="preserve">"BEAR"</w:t>
-      </w:r>
-      <w:r>
-        <w:rPr>
-          <w:rStyle w:val="FunctionTok"/>
-        </w:rPr>
-        <w:t xml:space="preserve">,</w:t>
-      </w:r>
-      <w:r>
-        <w:rPr>
-          <w:rStyle w:val="DataTypeTok"/>
-        </w:rPr>
-        <w:t xml:space="preserve">"vwap"</w:t>
-      </w:r>
-      <w:r>
-        <w:rPr>
-          <w:rStyle w:val="FunctionTok"/>
-        </w:rPr>
-        <w:t xml:space="preserve">:</w:t>
-      </w:r>
-      <w:r>
-        <w:rPr>
-          <w:rStyle w:val="StringTok"/>
-        </w:rPr>
-        <w:t xml:space="preserve">"BULL"</w:t>
-      </w:r>
-      <w:r>
-        <w:rPr>
-          <w:rStyle w:val="FunctionTok"/>
-        </w:rPr>
-        <w:t xml:space="preserve">}</w:t>
-      </w:r>
-    </w:p>
-    <w:p>
-      <w:pPr>
-        <w:numPr>
-          <w:ilvl w:val="0"/>
-          <w:numId w:val="1000"/>
-        </w:numPr>
-      </w:pPr>
-      <w:r>
-        <w:t xml:space="preserve">(Cada campo pode ser</w:t>
-      </w:r>
-      <w:r>
-        <w:t xml:space="preserve"> </w:t>
-      </w:r>
-      <w:r>
-        <w:rPr>
-          <w:rStyle w:val="VerbatimChar"/>
-        </w:rPr>
-        <w:t xml:space="preserve">BULL</w:t>
-      </w:r>
-      <w:r>
-        <w:t xml:space="preserve">,</w:t>
-      </w:r>
-      <w:r>
-        <w:t xml:space="preserve"> </w:t>
-      </w:r>
-      <w:r>
-        <w:rPr>
-          <w:rStyle w:val="VerbatimChar"/>
-        </w:rPr>
-        <w:t xml:space="preserve">BEAR</w:t>
-      </w:r>
-      <w:r>
-        <w:t xml:space="preserve"> </w:t>
-      </w:r>
-      <w:r>
-        <w:t xml:space="preserve">ou</w:t>
-      </w:r>
-      <w:r>
-        <w:t xml:space="preserve"> </w:t>
-      </w:r>
-      <w:r>
-        <w:rPr>
-          <w:rStyle w:val="VerbatimChar"/>
-        </w:rPr>
-        <w:t xml:space="preserve">NEUT</w:t>
-      </w:r>
-      <w:r>
-        <w:t xml:space="preserve">. O bot também entende</w:t>
-      </w:r>
-      <w:r>
-        <w:t xml:space="preserve"> </w:t>
-      </w:r>
-      <w:r>
-        <w:t xml:space="preserve">variações como up/down, buy/sell, 1/-1 — não precisa se preocupar com isso.)</w:t>
-      </w:r>
-    </w:p>
-    <w:p>
-      <w:pPr>
-        <w:numPr>
-          <w:ilvl w:val="0"/>
-          <w:numId w:val="1003"/>
-        </w:numPr>
-      </w:pPr>
-      <w:r>
-        <w:t xml:space="preserve">Salve. Repita para as outras moedas trocando</w:t>
-      </w:r>
-      <w:r>
-        <w:t xml:space="preserve"> </w:t>
-      </w:r>
-      <w:r>
-        <w:rPr>
-          <w:bCs/>
-          <w:b/>
-        </w:rPr>
-        <w:t xml:space="preserve">só o final da URL</w:t>
-      </w:r>
-      <w:r>
-        <w:t xml:space="preserve">.</w:t>
-      </w:r>
-    </w:p>
-    <w:p>
-      <w:pPr>
-        <w:pStyle w:val="BlockText"/>
-      </w:pPr>
-      <w:r>
-        <w:t xml:space="preserve">💡 São</w:t>
-      </w:r>
-      <w:r>
-        <w:t xml:space="preserve"> </w:t>
-      </w:r>
-      <w:r>
-        <w:rPr>
-          <w:bCs/>
-          <w:b/>
-        </w:rPr>
-        <w:t xml:space="preserve">10 alertas no total</w:t>
-      </w:r>
-      <w:r>
-        <w:t xml:space="preserve"> </w:t>
-      </w:r>
-      <w:r>
-        <w:t xml:space="preserve">(1 por moeda). Não precisa fazer todos hoje —</w:t>
-      </w:r>
-      <w:r>
-        <w:t xml:space="preserve"> </w:t>
-      </w:r>
-      <w:r>
-        <w:t xml:space="preserve">comece pelas que você mais opera; as demais entram em modo legado até você</w:t>
-      </w:r>
-      <w:r>
-        <w:t xml:space="preserve"> </w:t>
-      </w:r>
-      <w:r>
-        <w:t xml:space="preserve">criar o alerta delas.</w:t>
+        <w:t xml:space="preserve">.../catalyst/BTC</w:t>
+      </w:r>
+      <w:r>
+        <w:t xml:space="preserve">) — mas com o ajuste acima você não precisa dela.</w:t>
       </w:r>
     </w:p>
     <w:p>
@@ -2488,14 +2487,14 @@
         </w:pict>
       </w:r>
     </w:p>
-    <w:bookmarkEnd w:id="24"/>
-    <w:bookmarkStart w:id="25" w:name="como-conferir-se-está-funcionando"/>
+    <w:bookmarkEnd w:id="25"/>
+    <w:bookmarkStart w:id="26" w:name="como-conferir-se-está-funcionando"/>
     <w:p>
       <w:pPr>
         <w:pStyle w:val="Heading2"/>
       </w:pPr>
       <w:r>
-        <w:t xml:space="preserve">6. Como conferir se está funcionando</w:t>
+        <w:t xml:space="preserve">7. Como conferir se está funcionando</w:t>
       </w:r>
     </w:p>
     <w:p>
@@ -2725,14 +2724,14 @@
         </w:pict>
       </w:r>
     </w:p>
-    <w:bookmarkEnd w:id="25"/>
-    <w:bookmarkStart w:id="26" w:name="Xb99580c0b153684b2f01f6ca2cddc55dcc2bfa3"/>
+    <w:bookmarkEnd w:id="26"/>
+    <w:bookmarkStart w:id="27" w:name="Xb99580c0b153684b2f01f6ca2cddc55dcc2bfa3"/>
     <w:p>
       <w:pPr>
         <w:pStyle w:val="Heading2"/>
       </w:pPr>
       <w:r>
-        <w:t xml:space="preserve">7. Ajustes rápidos (no</w:t>
+        <w:t xml:space="preserve">8. Ajustes rápidos (no</w:t>
       </w:r>
       <w:r>
         <w:t xml:space="preserve"> </w:t>
@@ -2917,21 +2916,21 @@
         </w:pict>
       </w:r>
     </w:p>
-    <w:bookmarkEnd w:id="26"/>
-    <w:bookmarkStart w:id="27" w:name="segurança"/>
+    <w:bookmarkEnd w:id="27"/>
+    <w:bookmarkStart w:id="28" w:name="segurança"/>
     <w:p>
       <w:pPr>
         <w:pStyle w:val="Heading2"/>
       </w:pPr>
       <w:r>
-        <w:t xml:space="preserve">8. Segurança</w:t>
+        <w:t xml:space="preserve">9. Segurança</w:t>
       </w:r>
     </w:p>
     <w:p>
       <w:pPr>
         <w:numPr>
           <w:ilvl w:val="0"/>
-          <w:numId w:val="1004"/>
+          <w:numId w:val="1005"/>
         </w:numPr>
         <w:pStyle w:val="Compact"/>
       </w:pPr>
@@ -2978,7 +2977,7 @@
       <w:pPr>
         <w:numPr>
           <w:ilvl w:val="0"/>
-          <w:numId w:val="1004"/>
+          <w:numId w:val="1005"/>
         </w:numPr>
         <w:pStyle w:val="Compact"/>
       </w:pPr>
@@ -2990,17 +2989,71 @@
         <w:t xml:space="preserve">Nada foi mexido no Bot RIFLE</w:t>
       </w:r>
       <w:r>
-        <w:t xml:space="preserve"> </w:t>
-      </w:r>
-      <w:r>
-        <w:t xml:space="preserve">nem no bot do MNQ.</w:t>
+        <w:t xml:space="preserve">, nem no bot do MNQ, nem nos alertas dos</w:t>
+      </w:r>
+      <w:r>
+        <w:t xml:space="preserve"> </w:t>
+      </w:r>
+      <w:r>
+        <w:rPr>
+          <w:bCs/>
+          <w:b/>
+        </w:rPr>
+        <w:t xml:space="preserve">índices</w:t>
+      </w:r>
+      <w:r>
+        <w:t xml:space="preserve">. Este catalisador é</w:t>
+      </w:r>
+      <w:r>
+        <w:t xml:space="preserve"> </w:t>
+      </w:r>
+      <w:r>
+        <w:rPr>
+          <w:bCs/>
+          <w:b/>
+        </w:rPr>
+        <w:t xml:space="preserve">exclusivo do cripto</w:t>
+      </w:r>
+      <w:r>
+        <w:t xml:space="preserve"> </w:t>
+      </w:r>
+      <w:r>
+        <w:t xml:space="preserve">e roda em outro bot,</w:t>
+      </w:r>
+      <w:r>
+        <w:t xml:space="preserve"> </w:t>
+      </w:r>
+      <w:r>
+        <w:t xml:space="preserve">em outro endereço. Por isso pedimos para usar uma</w:t>
+      </w:r>
+      <w:r>
+        <w:t xml:space="preserve"> </w:t>
+      </w:r>
+      <w:r>
+        <w:rPr>
+          <w:bCs/>
+          <w:b/>
+        </w:rPr>
+        <w:t xml:space="preserve">cópia</w:t>
+      </w:r>
+      <w:r>
+        <w:t xml:space="preserve"> </w:t>
+      </w:r>
+      <w:r>
+        <w:t xml:space="preserve">do indicador</w:t>
+      </w:r>
+      <w:r>
+        <w:t xml:space="preserve"> </w:t>
+      </w:r>
+      <w:r>
+        <w:t xml:space="preserve">(seção 4) — o indicador do MNQ fica intocado.</w:t>
       </w:r>
     </w:p>
     <w:p>
       <w:pPr>
         <w:numPr>
           <w:ilvl w:val="0"/>
-          <w:numId w:val="1004"/>
+          <w:numId w:val="1005"/>
         </w:numPr>
         <w:pStyle w:val="Compact"/>
       </w:pPr>
@@ -3027,8 +3080,8 @@
         <w:t xml:space="preserve">os endpoints continuam no bot (não atrapalham; ficam de reserva).</w:t>
       </w:r>
     </w:p>
-    <w:bookmarkEnd w:id="27"/>
     <w:bookmarkEnd w:id="28"/>
+    <w:bookmarkEnd w:id="29"/>
     <w:sectPr/>
   </w:body>
 </w:document>
@@ -3336,6 +3389,36 @@
     </w:lvlOverride>
   </w:num>
   <w:num w:numId="1004">
+    <w:abstractNumId w:val="99411"/>
+    <w:lvlOverride w:ilvl="0">
+      <w:startOverride w:val="1"/>
+    </w:lvlOverride>
+    <w:lvlOverride w:ilvl="1">
+      <w:startOverride w:val="1"/>
+    </w:lvlOverride>
+    <w:lvlOverride w:ilvl="2">
+      <w:startOverride w:val="1"/>
+    </w:lvlOverride>
+    <w:lvlOverride w:ilvl="3">
+      <w:startOverride w:val="1"/>
+    </w:lvlOverride>
+    <w:lvlOverride w:ilvl="4">
+      <w:startOverride w:val="1"/>
+    </w:lvlOverride>
+    <w:lvlOverride w:ilvl="5">
+      <w:startOverride w:val="1"/>
+    </w:lvlOverride>
+    <w:lvlOverride w:ilvl="6">
+      <w:startOverride w:val="1"/>
+    </w:lvlOverride>
+    <w:lvlOverride w:ilvl="7">
+      <w:startOverride w:val="1"/>
+    </w:lvlOverride>
+    <w:lvlOverride w:ilvl="8">
+      <w:startOverride w:val="1"/>
+    </w:lvlOverride>
+  </w:num>
+  <w:num w:numId="1005">
     <w:abstractNumId w:val="991"/>
   </w:num>
 </w:numbering>

</xml_diff>